<commit_message>
Add poster backgrounds and update final project report
</commit_message>
<xml_diff>
--- a/AI Binge Buddy - Final Project Report.docx
+++ b/AI Binge Buddy - Final Project Report.docx
@@ -15,7 +15,7 @@
         <w:pStyle w:val="Subtitle"/>
       </w:pPr>
       <w:r>
-        <w:t xml:space="preserve">Final project report | 10 October 2026</w:t>
+        <w:t xml:space="preserve">Final project report | 11 October 2026</w:t>
       </w:r>
     </w:p>
     <w:p>
@@ -97,7 +97,7 @@
     </w:p>
     <w:p>
       <w:r>
-        <w:t xml:space="preserve">Started with Python scoring and limited LLM reranking, then moved to LLM-led selection of all eligible retrieved candidates. Removed runtime, mood and score controls. Enlarged fonts and forms, improved colours, added distinct commentary panels, aligned selection buttons and redesigned the wheel with poster sectors and watermark titles.</w:t>
+        <w:t xml:space="preserve">Moved from Python scoring to LLM-led selection of eligible TMDB candidates. Simplified preferences to four fields. Redesigned setup screens, enlarged fonts, separated AI commentary, added poster-filled wheel sectors and a winner celebration. Fixed stacked-screen navigation and wheel scroll handling. Added a faint poster-collage background while keeping form panels opaque for readability.</w:t>
       </w:r>
     </w:p>
     <w:p>
@@ -120,7 +120,7 @@
     </w:p>
     <w:p>
       <w:r>
-        <w:t xml:space="preserve">Latest verification: 21 automated tests passed, with wheel JavaScript checks previously passing. These checks cover validation, error/retry recovery and selection flows, but do not prove recommendation quality or visual perfection. No before-and-after performance benchmark was recorded.</w:t>
+        <w:t xml:space="preserve">Verification: 23 regression tests passed after the final background changes. A separate offline audit passed 25 button/action cases and six configured external-link checks; wheel outcomes and the scroll guard also passed. API responses were mocked. Actual browser scroll positions and external pages were not verified, and no performance benchmark was recorded.</w:t>
       </w:r>
     </w:p>
     <w:sectPr>

</xml_diff>